<commit_message>
Match inserted document text formatting to reference
</commit_message>
<xml_diff>
--- a/template.docx
+++ b/template.docx
@@ -86,6 +86,12 @@
         <w:rPr>
           <w:rFonts w:ascii="Times New Roman" w:eastAsia="Times New Roman" w:hAnsi="Times New Roman" w:cs="Times New Roman"/>
           <w:lang w:val="en-US"/>
+          <w:b/>
+          <w:bCs/>
+          <w:i w:val="0"/>
+          <w:iCs w:val="0"/>
+          <w:u w:val="none"/>
+          <w:color w:val="000000"/>
         </w:rPr>
         <w:t>{{ faculty</w:t>
       </w:r>
@@ -94,6 +100,12 @@
         <w:rPr>
           <w:rFonts w:ascii="Times New Roman" w:eastAsia="Times New Roman" w:hAnsi="Times New Roman" w:cs="Times New Roman"/>
           <w:lang w:val="en-US"/>
+          <w:b/>
+          <w:bCs/>
+          <w:i w:val="0"/>
+          <w:iCs w:val="0"/>
+          <w:u w:val="none"/>
+          <w:color w:val="000000"/>
         </w:rPr>
         <w:t xml:space="preserve"> }}</w:t>
       </w:r>
@@ -148,6 +160,10 @@
           <w:rFonts w:ascii="Times New Roman" w:eastAsia="Times New Roman" w:hAnsi="Times New Roman" w:cs="Times New Roman"/>
           <w:b/>
           <w:bCs/>
+          <w:i w:val="0"/>
+          <w:iCs w:val="0"/>
+          <w:u w:val="none"/>
+          <w:color w:val="000000"/>
         </w:rPr>
         <w:t>{{ student_name }}</w:t>
       </w:r>
@@ -175,6 +191,12 @@
       <w:r>
         <w:rPr>
           <w:rFonts w:ascii="Times New Roman" w:eastAsia="Times New Roman" w:hAnsi="Times New Roman" w:cs="Times New Roman"/>
+          <w:b/>
+          <w:bCs/>
+          <w:i w:val="1"/>
+          <w:iCs w:val="1"/>
+          <w:u w:val="single"/>
+          <w:color w:val="000000"/>
         </w:rPr>
         <w:t>{{ course }}</w:t>
       </w:r>
@@ -187,6 +209,12 @@
       <w:r>
         <w:rPr>
           <w:rFonts w:ascii="Times New Roman" w:eastAsia="Times New Roman" w:hAnsi="Times New Roman" w:cs="Times New Roman"/>
+          <w:b/>
+          <w:bCs/>
+          <w:i w:val="1"/>
+          <w:iCs w:val="1"/>
+          <w:u w:val="single"/>
+          <w:color w:val="000000"/>
         </w:rPr>
         <w:t>{{ group }}</w:t>
       </w:r>
@@ -199,6 +227,12 @@
       <w:r>
         <w:rPr>
           <w:rFonts w:ascii="Times New Roman" w:eastAsia="Times New Roman" w:hAnsi="Times New Roman" w:cs="Times New Roman"/>
+          <w:b/>
+          <w:bCs/>
+          <w:i w:val="1"/>
+          <w:iCs w:val="1"/>
+          <w:u w:val="single"/>
+          <w:color w:val="000000"/>
         </w:rPr>
         <w:t>{% if group_numbers %}{{ group_numbers }} – {% endif %}{{ spec }}</w:t>
       </w:r>
@@ -263,6 +297,12 @@
       <w:r>
         <w:rPr>
           <w:rFonts w:ascii="Times New Roman" w:eastAsia="Times New Roman" w:hAnsi="Times New Roman" w:cs="Times New Roman"/>
+          <w:b/>
+          <w:bCs/>
+          <w:i w:val="1"/>
+          <w:iCs w:val="1"/>
+          <w:u w:val="single"/>
+          <w:color w:val="000000"/>
         </w:rPr>
         <w:t>{{ curator_info }}</w:t>
       </w:r>
@@ -275,6 +315,12 @@
       <w:r>
         <w:rPr>
           <w:rFonts w:ascii="Times New Roman" w:eastAsia="Times New Roman" w:hAnsi="Times New Roman" w:cs="Times New Roman"/>
+          <w:b/>
+          <w:bCs/>
+          <w:i w:val="1"/>
+          <w:iCs w:val="1"/>
+          <w:u w:val="single"/>
+          <w:color w:val="000000"/>
         </w:rPr>
         <w:t>{{ zam_dekan_info }}</w:t>
       </w:r>
@@ -287,6 +333,12 @@
       <w:r>
         <w:rPr>
           <w:rFonts w:ascii="Times New Roman" w:eastAsia="Times New Roman" w:hAnsi="Times New Roman" w:cs="Times New Roman"/>
+          <w:b/>
+          <w:bCs/>
+          <w:i w:val="1"/>
+          <w:iCs w:val="1"/>
+          <w:u w:val="single"/>
+          <w:color w:val="000000"/>
         </w:rPr>
         <w:t>{{ dekan_info }}</w:t>
       </w:r>
@@ -811,6 +863,10 @@
                 <w:b/>
                 <w:bCs/>
                 <w:lang w:val="en-US"/>
+                <w:i w:val="0"/>
+                <w:iCs w:val="0"/>
+                <w:u w:val="none"/>
+                <w:color w:val="000000"/>
               </w:rPr>
               <w:t xml:space="preserve">{{ </w:t>
             </w:r>
@@ -821,6 +877,10 @@
                 <w:b/>
                 <w:bCs/>
                 <w:lang w:val="en-US"/>
+                <w:i w:val="0"/>
+                <w:iCs w:val="0"/>
+                <w:u w:val="none"/>
+                <w:color w:val="000000"/>
               </w:rPr>
               <w:t>dekan</w:t>
             </w:r>
@@ -831,6 +891,10 @@
                 <w:b/>
                 <w:bCs/>
                 <w:lang w:val="en-US"/>
+                <w:i w:val="0"/>
+                <w:iCs w:val="0"/>
+                <w:u w:val="none"/>
+                <w:color w:val="000000"/>
               </w:rPr>
               <w:t>_short</w:t>
             </w:r>
@@ -841,6 +905,10 @@
                 <w:b/>
                 <w:bCs/>
                 <w:lang w:val="en-US"/>
+                <w:i w:val="0"/>
+                <w:iCs w:val="0"/>
+                <w:u w:val="none"/>
+                <w:color w:val="000000"/>
               </w:rPr>
               <w:t xml:space="preserve"> }}</w:t>
             </w:r>
@@ -928,6 +996,10 @@
                 <w:b/>
                 <w:bCs/>
                 <w:lang w:val="en-US"/>
+                <w:i w:val="0"/>
+                <w:iCs w:val="0"/>
+                <w:u w:val="none"/>
+                <w:color w:val="000000"/>
               </w:rPr>
               <w:t xml:space="preserve">{{ </w:t>
             </w:r>
@@ -938,6 +1010,10 @@
                 <w:b/>
                 <w:bCs/>
                 <w:lang w:val="en-US"/>
+                <w:i w:val="0"/>
+                <w:iCs w:val="0"/>
+                <w:u w:val="none"/>
+                <w:color w:val="000000"/>
               </w:rPr>
               <w:t>student</w:t>
             </w:r>
@@ -948,6 +1024,10 @@
                 <w:b/>
                 <w:bCs/>
                 <w:lang w:val="en-US"/>
+                <w:i w:val="0"/>
+                <w:iCs w:val="0"/>
+                <w:u w:val="none"/>
+                <w:color w:val="000000"/>
               </w:rPr>
               <w:t>_short</w:t>
             </w:r>
@@ -958,6 +1038,10 @@
                 <w:b/>
                 <w:bCs/>
                 <w:lang w:val="en-US"/>
+                <w:i w:val="0"/>
+                <w:iCs w:val="0"/>
+                <w:u w:val="none"/>
+                <w:color w:val="000000"/>
               </w:rPr>
               <w:t xml:space="preserve"> }}</w:t>
             </w:r>

</xml_diff>

<commit_message>
Normalize input casing and add spacing before Hamzamon paragraph
</commit_message>
<xml_diff>
--- a/template.docx
+++ b/template.docx
@@ -348,6 +348,11 @@
         </w:rPr>
         <w:t xml:space="preserve"> мунтазам дар тамос шуда, маълумоти лозимаро пурсон шавед.</w:t>
       </w:r>
+    </w:p>
+    <w:p>
+      <w:pPr>
+        <w:spacing w:before="0" w:after="0"/>
+      </w:pPr>
     </w:p>
     <w:p>
       <w:pPr>

</xml_diff>

<commit_message>
Fix Ogohinoma single-page A4 print layout
</commit_message>
<xml_diff>
--- a/template.docx
+++ b/template.docx
@@ -6,7 +6,7 @@
       <w:pPr>
         <w:pStyle w:val="Heading3"/>
         <w:keepLines/>
-        <w:spacing w:before="0" w:after="0"/>
+        <w:spacing w:before="0" w:after="0" w:line="240" w:lineRule="auto" w:beforeAutospacing="0" w:afterAutospacing="0"/>
         <w:jc w:val="center"/>
         <w:rPr>
           <w:rFonts w:ascii="Times New Roman" w:eastAsia="Times New Roman" w:hAnsi="Times New Roman" w:cs="Times New Roman"/>
@@ -27,7 +27,7 @@
       <w:pPr>
         <w:pStyle w:val="Heading4"/>
         <w:keepLines/>
-        <w:spacing w:before="0" w:after="0"/>
+        <w:spacing w:before="0" w:after="0" w:line="240" w:lineRule="auto" w:beforeAutospacing="0" w:afterAutospacing="0"/>
         <w:jc w:val="center"/>
         <w:rPr>
           <w:rFonts w:ascii="Times New Roman" w:eastAsia="Times New Roman" w:hAnsi="Times New Roman" w:cs="Times New Roman"/>
@@ -60,6 +60,7 @@
           <w:b/>
           <w:bCs/>
         </w:rPr>
+        <w:spacing w:before="0" w:after="0" w:line="240" w:lineRule="auto" w:beforeAutospacing="0" w:afterAutospacing="0"/>
       </w:pPr>
       <w:r>
         <w:rPr>
@@ -74,7 +75,7 @@
       <w:pPr>
         <w:pStyle w:val="Heading4"/>
         <w:keepLines/>
-        <w:spacing w:before="0" w:after="0"/>
+        <w:spacing w:before="0" w:after="0" w:line="240" w:lineRule="auto" w:beforeAutospacing="0" w:afterAutospacing="0"/>
         <w:jc w:val="center"/>
         <w:rPr>
           <w:rFonts w:ascii="Times New Roman" w:eastAsia="Times New Roman" w:hAnsi="Times New Roman" w:cs="Times New Roman"/>
@@ -110,11 +111,15 @@
         <w:t xml:space="preserve"> }}</w:t>
       </w:r>
     </w:p>
-    <w:p/>
     <w:p>
       <w:pPr>
+        <w:spacing w:before="0" w:after="0" w:line="40" w:lineRule="exact" w:beforeAutospacing="0" w:afterAutospacing="0"/>
+      </w:pPr>
+    </w:p>
+    <w:p>
+      <w:pPr>
         <w:pStyle w:val="Heading2"/>
-        <w:spacing w:before="0"/>
+        <w:spacing w:before="0" w:after="0" w:line="240" w:lineRule="auto" w:beforeAutospacing="0" w:afterAutospacing="0"/>
         <w:jc w:val="center"/>
         <w:rPr>
           <w:rFonts w:ascii="Times New Roman" w:eastAsia="Times New Roman" w:hAnsi="Times New Roman" w:cs="Times New Roman"/>
@@ -146,6 +151,7 @@
           <w:b/>
           <w:bCs/>
         </w:rPr>
+        <w:spacing w:before="0" w:after="0" w:line="240" w:lineRule="auto" w:beforeAutospacing="0" w:afterAutospacing="0"/>
       </w:pPr>
       <w:r>
         <w:rPr>
@@ -183,6 +189,7 @@
         <w:rPr>
           <w:rFonts w:ascii="Times New Roman" w:eastAsia="Times New Roman" w:hAnsi="Times New Roman" w:cs="Times New Roman"/>
         </w:rPr>
+        <w:spacing w:before="0" w:after="0" w:line="240" w:lineRule="auto" w:beforeAutospacing="0" w:afterAutospacing="0"/>
       </w:pPr>
       <w:r>
         <w:rPr>
@@ -260,6 +267,7 @@
           <w:i/>
           <w:iCs/>
         </w:rPr>
+        <w:spacing w:before="0" w:after="0" w:line="240" w:lineRule="auto" w:beforeAutospacing="0" w:afterAutospacing="0"/>
       </w:pPr>
       <w:r>
         <w:rPr>
@@ -289,6 +297,7 @@
         <w:rPr>
           <w:rFonts w:ascii="Times New Roman" w:eastAsia="Times New Roman" w:hAnsi="Times New Roman" w:cs="Times New Roman"/>
         </w:rPr>
+        <w:spacing w:before="0" w:after="0" w:line="240" w:lineRule="auto" w:beforeAutospacing="0" w:afterAutospacing="0"/>
       </w:pPr>
       <w:r>
         <w:rPr>
@@ -353,7 +362,7 @@
     </w:p>
     <w:p>
       <w:pPr>
-        <w:spacing w:before="0" w:after="0"/>
+        <w:spacing w:before="0" w:after="0" w:line="40" w:lineRule="exact" w:beforeAutospacing="0" w:afterAutospacing="0"/>
       </w:pPr>
     </w:p>
     <w:p>
@@ -369,6 +378,7 @@
         <w:rPr>
           <w:rFonts w:ascii="Times New Roman" w:eastAsia="Times New Roman" w:hAnsi="Times New Roman" w:cs="Times New Roman"/>
         </w:rPr>
+        <w:spacing w:before="0" w:after="0" w:line="240" w:lineRule="auto" w:beforeAutospacing="0" w:afterAutospacing="0"/>
       </w:pPr>
       <w:r>
         <w:rPr>
@@ -392,6 +402,7 @@
           <w:i/>
           <w:iCs/>
         </w:rPr>
+        <w:spacing w:before="0" w:after="0" w:line="240" w:lineRule="auto" w:beforeAutospacing="0" w:afterAutospacing="0"/>
       </w:pPr>
       <w:r>
         <w:rPr>
@@ -426,6 +437,7 @@
           <w:i/>
           <w:iCs/>
         </w:rPr>
+        <w:spacing w:before="0" w:after="0" w:line="240" w:lineRule="auto" w:beforeAutospacing="0" w:afterAutospacing="0"/>
       </w:pPr>
       <w:r>
         <w:rPr>
@@ -460,6 +472,7 @@
           <w:i/>
           <w:iCs/>
         </w:rPr>
+        <w:spacing w:before="0" w:after="0" w:line="240" w:lineRule="auto" w:beforeAutospacing="0" w:afterAutospacing="0"/>
       </w:pPr>
       <w:r>
         <w:rPr>
@@ -493,6 +506,7 @@
           <w:i/>
           <w:iCs/>
         </w:rPr>
+        <w:spacing w:before="0" w:after="0" w:line="240" w:lineRule="auto" w:beforeAutospacing="0" w:afterAutospacing="0"/>
       </w:pPr>
       <w:r>
         <w:rPr>
@@ -527,6 +541,7 @@
           <w:i/>
           <w:iCs/>
         </w:rPr>
+        <w:spacing w:before="0" w:after="0" w:line="240" w:lineRule="auto" w:beforeAutospacing="0" w:afterAutospacing="0"/>
       </w:pPr>
       <w:r>
         <w:rPr>
@@ -561,6 +576,7 @@
           <w:i/>
           <w:iCs/>
         </w:rPr>
+        <w:spacing w:before="0" w:after="0" w:line="240" w:lineRule="auto" w:beforeAutospacing="0" w:afterAutospacing="0"/>
       </w:pPr>
       <w:r>
         <w:rPr>
@@ -595,6 +611,7 @@
           <w:i/>
           <w:iCs/>
         </w:rPr>
+        <w:spacing w:before="0" w:after="0" w:line="240" w:lineRule="auto" w:beforeAutospacing="0" w:afterAutospacing="0"/>
       </w:pPr>
       <w:r>
         <w:rPr>
@@ -629,6 +646,7 @@
           <w:i/>
           <w:iCs/>
         </w:rPr>
+        <w:spacing w:before="0" w:after="0" w:line="240" w:lineRule="auto" w:beforeAutospacing="0" w:afterAutospacing="0"/>
       </w:pPr>
       <w:r>
         <w:rPr>
@@ -662,6 +680,7 @@
           <w:i/>
           <w:iCs/>
         </w:rPr>
+        <w:spacing w:before="0" w:after="0" w:line="240" w:lineRule="auto" w:beforeAutospacing="0" w:afterAutospacing="0"/>
       </w:pPr>
       <w:r>
         <w:rPr>
@@ -678,29 +697,11 @@
           <w:iCs/>
         </w:rPr>
         <w:t>ба муассисаи таълимӣ омадан бо идора намудани воситаҳои нақлиёти механикӣ, (бе ҳуқуқи барқароршавӣ ба муддати се сол);</w:t>
-      </w:r>
-    </w:p>
-    <w:p>
-      <w:pPr>
-        <w:rPr>
-          <w:rFonts w:ascii="Times New Roman" w:eastAsia="Times New Roman" w:hAnsi="Times New Roman" w:cs="Times New Roman"/>
-          <w:b/>
-          <w:bCs/>
-        </w:rPr>
-      </w:pPr>
-      <w:r>
-        <w:rPr>
-          <w:rFonts w:ascii="Times New Roman" w:eastAsia="Times New Roman" w:hAnsi="Times New Roman" w:cs="Times New Roman"/>
-          <w:b/>
-          <w:bCs/>
-        </w:rPr>
-        <w:t>Огоҳномаро гирифтам ва уҳдадор мешавам, ки ба волидайнам расонам:</w:t>
       </w:r>
     </w:p>
     <w:tbl>
       <w:tblPr>
         <w:tblStyle w:val="a"/>
-        <w:tblpPr w:leftFromText="180" w:rightFromText="180" w:topFromText="180" w:bottomFromText="180" w:vertAnchor="text"/>
         <w:tblW w:w="9360" w:type="dxa"/>
         <w:tblInd w:w="0" w:type="dxa"/>
         <w:tblBorders>
@@ -743,6 +744,7 @@
                 <w:b/>
                 <w:bCs/>
               </w:rPr>
+              <w:spacing w:before="0" w:after="0" w:line="240" w:lineRule="auto" w:beforeAutospacing="0" w:afterAutospacing="0"/>
             </w:pPr>
             <w:r>
               <w:rPr>
@@ -771,6 +773,7 @@
               <w:rPr>
                 <w:rFonts w:ascii="Times New Roman" w:eastAsia="Times New Roman" w:hAnsi="Times New Roman" w:cs="Times New Roman"/>
               </w:rPr>
+              <w:spacing w:before="0" w:after="0" w:line="240" w:lineRule="auto" w:beforeAutospacing="0" w:afterAutospacing="0"/>
             </w:pPr>
             <w:r>
               <w:rPr>
@@ -787,6 +790,7 @@
                 <w:sz w:val="16"/>
                 <w:szCs w:val="16"/>
               </w:rPr>
+              <w:spacing w:before="0" w:after="0" w:line="240" w:lineRule="auto" w:beforeAutospacing="0" w:afterAutospacing="0"/>
             </w:pPr>
             <w:r>
               <w:rPr>
@@ -815,6 +819,7 @@
               <w:rPr>
                 <w:rFonts w:ascii="Times New Roman" w:eastAsia="Times New Roman" w:hAnsi="Times New Roman" w:cs="Times New Roman"/>
               </w:rPr>
+              <w:spacing w:before="0" w:after="0" w:line="240" w:lineRule="auto" w:beforeAutospacing="0" w:afterAutospacing="0"/>
             </w:pPr>
             <w:r>
               <w:rPr>
@@ -831,6 +836,7 @@
                 <w:b/>
                 <w:bCs/>
               </w:rPr>
+              <w:spacing w:before="0" w:after="0" w:line="240" w:lineRule="auto" w:beforeAutospacing="0" w:afterAutospacing="0"/>
             </w:pPr>
             <w:r>
               <w:rPr>
@@ -862,6 +868,7 @@
                 <w:bCs/>
                 <w:lang w:val="en-US"/>
               </w:rPr>
+              <w:spacing w:before="0" w:after="0" w:line="240" w:lineRule="auto" w:beforeAutospacing="0" w:afterAutospacing="0"/>
             </w:pPr>
             <w:proofErr w:type="gramStart"/>
             <w:r>
@@ -925,20 +932,12 @@
     </w:tbl>
     <w:p>
       <w:pPr>
-        <w:pBdr>
-          <w:top w:val="nil"/>
-          <w:left w:val="nil"/>
-          <w:bottom w:val="nil"/>
-          <w:right w:val="nil"/>
-          <w:between w:val="nil"/>
-        </w:pBdr>
         <w:rPr>
           <w:rFonts w:ascii="Times New Roman" w:eastAsia="Times New Roman" w:hAnsi="Times New Roman" w:cs="Times New Roman"/>
           <w:b/>
           <w:bCs/>
-          <w:sz w:val="24"/>
-          <w:szCs w:val="24"/>
-        </w:rPr>
+        </w:rPr>
+        <w:spacing w:before="0" w:after="0" w:line="240" w:lineRule="auto" w:beforeAutospacing="0" w:afterAutospacing="0"/>
       </w:pPr>
       <w:r>
         <w:rPr>
@@ -946,13 +945,12 @@
           <w:b/>
           <w:bCs/>
         </w:rPr>
-        <w:t>Бо мазмуни огоҳинома шинос гардидам:</w:t>
+        <w:t>Огоҳномаро гирифтам ва уҳдадор мешавам, ки ба волидайнам расонам:</w:t>
       </w:r>
     </w:p>
     <w:tbl>
       <w:tblPr>
         <w:tblStyle w:val="a0"/>
-        <w:tblpPr w:leftFromText="180" w:rightFromText="180" w:topFromText="180" w:bottomFromText="180" w:vertAnchor="text" w:tblpX="30"/>
         <w:tblW w:w="9360" w:type="dxa"/>
         <w:tblInd w:w="0" w:type="dxa"/>
         <w:tblBorders>
@@ -995,6 +993,7 @@
                 <w:bCs/>
                 <w:lang w:val="en-US"/>
               </w:rPr>
+              <w:spacing w:before="0" w:after="0" w:line="240" w:lineRule="auto" w:beforeAutospacing="0" w:afterAutospacing="0"/>
             </w:pPr>
             <w:proofErr w:type="gramStart"/>
             <w:r>
@@ -1071,6 +1070,7 @@
               <w:rPr>
                 <w:rFonts w:ascii="Times New Roman" w:eastAsia="Times New Roman" w:hAnsi="Times New Roman" w:cs="Times New Roman"/>
               </w:rPr>
+              <w:spacing w:before="0" w:after="0" w:line="240" w:lineRule="auto" w:beforeAutospacing="0" w:afterAutospacing="0"/>
             </w:pPr>
             <w:r>
               <w:rPr>
@@ -1087,6 +1087,7 @@
                 <w:sz w:val="16"/>
                 <w:szCs w:val="16"/>
               </w:rPr>
+              <w:spacing w:before="0" w:after="0" w:line="240" w:lineRule="auto" w:beforeAutospacing="0" w:afterAutospacing="0"/>
             </w:pPr>
             <w:r>
               <w:rPr>
@@ -1115,6 +1116,7 @@
               <w:rPr>
                 <w:rFonts w:ascii="Times New Roman" w:eastAsia="Times New Roman" w:hAnsi="Times New Roman" w:cs="Times New Roman"/>
               </w:rPr>
+              <w:spacing w:before="0" w:after="0" w:line="240" w:lineRule="auto" w:beforeAutospacing="0" w:afterAutospacing="0"/>
             </w:pPr>
             <w:r>
               <w:rPr>
@@ -1131,6 +1133,7 @@
                 <w:b/>
                 <w:bCs/>
               </w:rPr>
+              <w:spacing w:before="0" w:after="0" w:line="240" w:lineRule="auto" w:beforeAutospacing="0" w:afterAutospacing="0"/>
             </w:pPr>
             <w:r>
               <w:rPr>
@@ -1157,13 +1160,40 @@
           <w:rFonts w:ascii="Times New Roman" w:eastAsia="Times New Roman" w:hAnsi="Times New Roman" w:cs="Times New Roman"/>
           <w:b/>
           <w:bCs/>
-        </w:rPr>
+          <w:sz w:val="24"/>
+          <w:szCs w:val="24"/>
+        </w:rPr>
+        <w:spacing w:before="0" w:after="0" w:line="240" w:lineRule="auto" w:beforeAutospacing="0" w:afterAutospacing="0"/>
+      </w:pPr>
+      <w:r>
+        <w:rPr>
+          <w:rFonts w:ascii="Times New Roman" w:eastAsia="Times New Roman" w:hAnsi="Times New Roman" w:cs="Times New Roman"/>
+          <w:b/>
+          <w:bCs/>
+        </w:rPr>
+        <w:t>Бо мазмуни огоҳинома шинос гардидам:</w:t>
+      </w:r>
+    </w:p>
+    <w:p>
+      <w:pPr>
+        <w:pBdr>
+          <w:top w:val="nil"/>
+          <w:left w:val="nil"/>
+          <w:bottom w:val="nil"/>
+          <w:right w:val="nil"/>
+          <w:between w:val="nil"/>
+        </w:pBdr>
+        <w:rPr>
+          <w:rFonts w:ascii="Times New Roman" w:eastAsia="Times New Roman" w:hAnsi="Times New Roman" w:cs="Times New Roman"/>
+          <w:b/>
+          <w:bCs/>
+        </w:rPr>
+        <w:spacing w:before="0" w:after="0" w:line="40" w:lineRule="exact" w:beforeAutospacing="0" w:afterAutospacing="0"/>
       </w:pPr>
     </w:p>
     <w:tbl>
       <w:tblPr>
         <w:tblStyle w:val="a1"/>
-        <w:tblpPr w:leftFromText="180" w:rightFromText="180" w:topFromText="180" w:bottomFromText="180" w:vertAnchor="text"/>
         <w:tblW w:w="9360" w:type="dxa"/>
         <w:tblInd w:w="0" w:type="dxa"/>
         <w:tblBorders>
@@ -1201,6 +1231,7 @@
               <w:rPr>
                 <w:rFonts w:ascii="Times New Roman" w:eastAsia="Times New Roman" w:hAnsi="Times New Roman" w:cs="Times New Roman"/>
               </w:rPr>
+              <w:spacing w:before="0" w:after="0" w:line="240" w:lineRule="auto" w:beforeAutospacing="0" w:afterAutospacing="0"/>
             </w:pPr>
             <w:r>
               <w:rPr>
@@ -1216,6 +1247,7 @@
                 <w:b/>
                 <w:bCs/>
               </w:rPr>
+              <w:spacing w:before="0" w:after="0" w:line="240" w:lineRule="auto" w:beforeAutospacing="0" w:afterAutospacing="0"/>
             </w:pPr>
             <w:r>
               <w:rPr>
@@ -1251,6 +1283,7 @@
               <w:rPr>
                 <w:rFonts w:ascii="Times New Roman" w:eastAsia="Times New Roman" w:hAnsi="Times New Roman" w:cs="Times New Roman"/>
               </w:rPr>
+              <w:spacing w:before="0" w:after="0" w:line="240" w:lineRule="auto" w:beforeAutospacing="0" w:afterAutospacing="0"/>
             </w:pPr>
             <w:r>
               <w:rPr>
@@ -1267,6 +1300,7 @@
                 <w:sz w:val="16"/>
                 <w:szCs w:val="16"/>
               </w:rPr>
+              <w:spacing w:before="0" w:after="0" w:line="240" w:lineRule="auto" w:beforeAutospacing="0" w:afterAutospacing="0"/>
             </w:pPr>
             <w:r>
               <w:rPr>
@@ -1294,6 +1328,7 @@
               <w:rPr>
                 <w:rFonts w:ascii="Times New Roman" w:eastAsia="Times New Roman" w:hAnsi="Times New Roman" w:cs="Times New Roman"/>
               </w:rPr>
+              <w:spacing w:before="0" w:after="0" w:line="240" w:lineRule="auto" w:beforeAutospacing="0" w:afterAutospacing="0"/>
             </w:pPr>
             <w:r>
               <w:rPr>
@@ -1310,6 +1345,7 @@
                 <w:b/>
                 <w:bCs/>
               </w:rPr>
+              <w:spacing w:before="0" w:after="0" w:line="240" w:lineRule="auto" w:beforeAutospacing="0" w:afterAutospacing="0"/>
             </w:pPr>
             <w:r>
               <w:rPr>
@@ -1332,7 +1368,7 @@
     <w:p>
       <w:pPr>
         <w:pStyle w:val="Heading3"/>
-        <w:spacing w:before="0" w:after="0" w:line="14" w:lineRule="auto"/>
+        <w:spacing w:before="0" w:after="0" w:line="40" w:lineRule="exact" w:beforeAutospacing="0" w:afterAutospacing="0"/>
         <w:ind w:right="-900"/>
         <w:rPr>
           <w:rFonts w:ascii="Times New Roman" w:eastAsia="Times New Roman" w:hAnsi="Times New Roman" w:cs="Times New Roman"/>
@@ -1340,8 +1376,8 @@
       </w:pPr>
     </w:p>
     <w:sectPr>
-      <w:pgSz w:w="12240" w:h="15840"/>
-      <w:pgMar w:top="1440" w:right="1440" w:bottom="1440" w:left="1440" w:header="0" w:footer="0" w:gutter="0"/>
+      <w:pgSz w:w="11906" w:h="16838"/>
+      <w:pgMar w:top="850" w:right="1021" w:bottom="850" w:left="1021" w:header="0" w:footer="0" w:gutter="0"/>
       <w:pgNumType w:start="1"/>
       <w:cols w:space="720"/>
     </w:sectPr>

</xml_diff>

<commit_message>
Match Ogohinoma print layout to original form
</commit_message>
<xml_diff>
--- a/template.docx
+++ b/template.docx
@@ -17,8 +17,8 @@
       <w:r>
         <w:rPr>
           <w:rFonts w:ascii="Times New Roman" w:eastAsia="Times New Roman" w:hAnsi="Times New Roman" w:cs="Times New Roman"/>
-          <w:sz w:val="22"/>
-          <w:szCs w:val="22"/>
+          <w:sz w:val="23"/>
+          <w:szCs w:val="23"/>
         </w:rPr>
         <w:t>ВАЗОРАТИ МАОРИФ ВА ИЛМИ ҶУМҲУРИИ ТОҶИКИСТОН</w:t>
       </w:r>
@@ -38,8 +38,8 @@
       <w:r>
         <w:rPr>
           <w:rFonts w:ascii="Times New Roman" w:eastAsia="Times New Roman" w:hAnsi="Times New Roman" w:cs="Times New Roman"/>
-          <w:sz w:val="22"/>
-          <w:szCs w:val="22"/>
+          <w:sz w:val="23"/>
+          <w:szCs w:val="23"/>
         </w:rPr>
         <w:t>МТД "ДОНИШКАДАИ ПОЛИТЕХНИКИИ ДОНИШГОҲИ ТЕХНИКИИ ТОҶИКИСТОН</w:t>
       </w:r>
@@ -67,6 +67,8 @@
           <w:rFonts w:ascii="Times New Roman" w:eastAsia="Times New Roman" w:hAnsi="Times New Roman" w:cs="Times New Roman"/>
           <w:b/>
           <w:bCs/>
+          <w:sz w:val="23"/>
+          <w:szCs w:val="23"/>
         </w:rPr>
         <w:t>ба номи академик М.С.Осимӣ дар шаҳри Хуҷанд"</w:t>
       </w:r>
@@ -93,6 +95,8 @@
           <w:iCs w:val="0"/>
           <w:u w:val="none"/>
           <w:color w:val="000000"/>
+          <w:sz w:val="23"/>
+          <w:szCs w:val="23"/>
         </w:rPr>
         <w:t>{{ faculty</w:t>
       </w:r>
@@ -107,19 +111,21 @@
           <w:iCs w:val="0"/>
           <w:u w:val="none"/>
           <w:color w:val="000000"/>
+          <w:sz w:val="23"/>
+          <w:szCs w:val="23"/>
         </w:rPr>
         <w:t xml:space="preserve"> }}</w:t>
       </w:r>
     </w:p>
     <w:p>
       <w:pPr>
-        <w:spacing w:before="0" w:after="0" w:line="40" w:lineRule="exact" w:beforeAutospacing="0" w:afterAutospacing="0"/>
+        <w:spacing w:before="0" w:after="0" w:line="100" w:lineRule="exact" w:beforeAutospacing="0" w:afterAutospacing="0"/>
       </w:pPr>
     </w:p>
     <w:p>
       <w:pPr>
         <w:pStyle w:val="Heading2"/>
-        <w:spacing w:before="0" w:after="0" w:line="240" w:lineRule="auto" w:beforeAutospacing="0" w:afterAutospacing="0"/>
+        <w:spacing w:before="100" w:after="160" w:line="240" w:lineRule="auto" w:beforeAutospacing="0" w:afterAutospacing="0"/>
         <w:jc w:val="center"/>
         <w:rPr>
           <w:rFonts w:ascii="Times New Roman" w:eastAsia="Times New Roman" w:hAnsi="Times New Roman" w:cs="Times New Roman"/>
@@ -130,8 +136,8 @@
       <w:r>
         <w:rPr>
           <w:rFonts w:ascii="Times New Roman" w:eastAsia="Times New Roman" w:hAnsi="Times New Roman" w:cs="Times New Roman"/>
-          <w:sz w:val="28"/>
-          <w:szCs w:val="28"/>
+          <w:sz w:val="32"/>
+          <w:szCs w:val="32"/>
         </w:rPr>
         <w:t>ОГОҲИНОМА</w:t>
       </w:r>
@@ -151,7 +157,8 @@
           <w:b/>
           <w:bCs/>
         </w:rPr>
-        <w:spacing w:before="0" w:after="0" w:line="240" w:lineRule="auto" w:beforeAutospacing="0" w:afterAutospacing="0"/>
+        <w:spacing w:before="100" w:after="100" w:line="260" w:lineRule="auto" w:beforeAutospacing="0" w:afterAutospacing="0"/>
+        <w:jc w:val="left"/>
       </w:pPr>
       <w:r>
         <w:rPr>
@@ -160,6 +167,8 @@
           <w:bCs/>
           <w:i w:val="1"/>
           <w:iCs w:val="1"/>
+          <w:sz w:val="26"/>
+          <w:szCs w:val="26"/>
         </w:rPr>
         <w:t xml:space="preserve">Ба волидайни донишҷӯ </w:t>
       </w:r>
@@ -172,6 +181,8 @@
           <w:iCs w:val="0"/>
           <w:u w:val="none"/>
           <w:color w:val="000000"/>
+          <w:sz w:val="26"/>
+          <w:szCs w:val="26"/>
         </w:rPr>
         <w:t>{{ student_name }}</w:t>
       </w:r>
@@ -189,11 +200,14 @@
         <w:rPr>
           <w:rFonts w:ascii="Times New Roman" w:eastAsia="Times New Roman" w:hAnsi="Times New Roman" w:cs="Times New Roman"/>
         </w:rPr>
-        <w:spacing w:before="0" w:after="0" w:line="240" w:lineRule="auto" w:beforeAutospacing="0" w:afterAutospacing="0"/>
-      </w:pPr>
-      <w:r>
-        <w:rPr>
-          <w:rFonts w:ascii="Times New Roman" w:eastAsia="Times New Roman" w:hAnsi="Times New Roman" w:cs="Times New Roman"/>
+        <w:spacing w:before="0" w:after="40" w:line="260" w:lineRule="auto" w:beforeAutospacing="0" w:afterAutospacing="0"/>
+        <w:jc w:val="both"/>
+      </w:pPr>
+      <w:r>
+        <w:rPr>
+          <w:rFonts w:ascii="Times New Roman" w:eastAsia="Times New Roman" w:hAnsi="Times New Roman" w:cs="Times New Roman"/>
+          <w:sz w:val="26"/>
+          <w:szCs w:val="26"/>
         </w:rPr>
         <w:t xml:space="preserve">Ба маълумоти шумо мерасонем, фарзанди шумо дар курси </w:t>
       </w:r>
@@ -206,12 +220,16 @@
           <w:iCs w:val="1"/>
           <w:u w:val="single"/>
           <w:color w:val="000000"/>
+          <w:sz w:val="26"/>
+          <w:szCs w:val="26"/>
         </w:rPr>
         <w:t>{{ course }}</w:t>
       </w:r>
       <w:r>
         <w:rPr>
           <w:rFonts w:ascii="Times New Roman" w:eastAsia="Times New Roman" w:hAnsi="Times New Roman" w:cs="Times New Roman"/>
+          <w:sz w:val="26"/>
+          <w:szCs w:val="26"/>
         </w:rPr>
         <w:t xml:space="preserve">, гурyҳи </w:t>
       </w:r>
@@ -224,12 +242,16 @@
           <w:iCs w:val="1"/>
           <w:u w:val="single"/>
           <w:color w:val="000000"/>
+          <w:sz w:val="26"/>
+          <w:szCs w:val="26"/>
         </w:rPr>
         <w:t>{{ group }}</w:t>
       </w:r>
       <w:r>
         <w:rPr>
           <w:rFonts w:ascii="Times New Roman" w:eastAsia="Times New Roman" w:hAnsi="Times New Roman" w:cs="Times New Roman"/>
+          <w:sz w:val="26"/>
+          <w:szCs w:val="26"/>
         </w:rPr>
         <w:t xml:space="preserve">, ихтисоси </w:t>
       </w:r>
@@ -242,12 +264,16 @@
           <w:iCs w:val="1"/>
           <w:u w:val="single"/>
           <w:color w:val="000000"/>
+          <w:sz w:val="26"/>
+          <w:szCs w:val="26"/>
         </w:rPr>
         <w:t>{% if group_numbers %}{{ group_numbers }} – {% endif %}{{ spec }}</w:t>
       </w:r>
       <w:r>
         <w:rPr>
           <w:rFonts w:ascii="Times New Roman" w:eastAsia="Times New Roman" w:hAnsi="Times New Roman" w:cs="Times New Roman"/>
+          <w:sz w:val="26"/>
+          <w:szCs w:val="26"/>
         </w:rPr>
         <w:t>, таҳсил менамояд.</w:t>
       </w:r>
@@ -267,11 +293,14 @@
           <w:i/>
           <w:iCs/>
         </w:rPr>
-        <w:spacing w:before="0" w:after="0" w:line="240" w:lineRule="auto" w:beforeAutospacing="0" w:afterAutospacing="0"/>
-      </w:pPr>
-      <w:r>
-        <w:rPr>
-          <w:rFonts w:ascii="Times New Roman" w:eastAsia="Times New Roman" w:hAnsi="Times New Roman" w:cs="Times New Roman"/>
+        <w:spacing w:before="0" w:after="40" w:line="260" w:lineRule="auto" w:beforeAutospacing="0" w:afterAutospacing="0"/>
+        <w:jc w:val="both"/>
+      </w:pPr>
+      <w:r>
+        <w:rPr>
+          <w:rFonts w:ascii="Times New Roman" w:eastAsia="Times New Roman" w:hAnsi="Times New Roman" w:cs="Times New Roman"/>
+          <w:sz w:val="26"/>
+          <w:szCs w:val="26"/>
         </w:rPr>
         <w:t xml:space="preserve">Мувофиқи талаботи зербанди 2, моддаи 46 Қонуни Ҷумҳурии Тоҷикистон дар бораи маориф </w:t>
       </w:r>
@@ -280,6 +309,8 @@
           <w:rFonts w:ascii="Times New Roman" w:eastAsia="Times New Roman" w:hAnsi="Times New Roman" w:cs="Times New Roman"/>
           <w:i/>
           <w:iCs/>
+          <w:sz w:val="26"/>
+          <w:szCs w:val="26"/>
         </w:rPr>
         <w:t>"Падару модари (шахсони онҳоро ивазкунандаи) таълимгирандагон уҳдадоранд, ки бо раванди таълиму тарбия, мазмуну давомоти таҳсилот ва сатҳи дониши фарзандонашон шинос шаванд".</w:t>
       </w:r>
@@ -297,11 +328,14 @@
         <w:rPr>
           <w:rFonts w:ascii="Times New Roman" w:eastAsia="Times New Roman" w:hAnsi="Times New Roman" w:cs="Times New Roman"/>
         </w:rPr>
-        <w:spacing w:before="0" w:after="0" w:line="240" w:lineRule="auto" w:beforeAutospacing="0" w:afterAutospacing="0"/>
-      </w:pPr>
-      <w:r>
-        <w:rPr>
-          <w:rFonts w:ascii="Times New Roman" w:eastAsia="Times New Roman" w:hAnsi="Times New Roman" w:cs="Times New Roman"/>
+        <w:spacing w:before="0" w:after="40" w:line="260" w:lineRule="auto" w:beforeAutospacing="0" w:afterAutospacing="0"/>
+        <w:jc w:val="both"/>
+      </w:pPr>
+      <w:r>
+        <w:rPr>
+          <w:rFonts w:ascii="Times New Roman" w:eastAsia="Times New Roman" w:hAnsi="Times New Roman" w:cs="Times New Roman"/>
+          <w:sz w:val="26"/>
+          <w:szCs w:val="26"/>
         </w:rPr>
         <w:t xml:space="preserve">Бинобар ин Шумо метавонед нисбати таҳсили фарзандатон бо куратори гурух </w:t>
       </w:r>
@@ -314,12 +348,16 @@
           <w:iCs w:val="1"/>
           <w:u w:val="single"/>
           <w:color w:val="000000"/>
+          <w:sz w:val="26"/>
+          <w:szCs w:val="26"/>
         </w:rPr>
         <w:t>{{ curator_info }}</w:t>
       </w:r>
       <w:r>
         <w:rPr>
           <w:rFonts w:ascii="Times New Roman" w:eastAsia="Times New Roman" w:hAnsi="Times New Roman" w:cs="Times New Roman"/>
+          <w:sz w:val="26"/>
+          <w:szCs w:val="26"/>
         </w:rPr>
         <w:t xml:space="preserve">, муовини декан оид ба тарбия </w:t>
       </w:r>
@@ -332,12 +370,16 @@
           <w:iCs w:val="1"/>
           <w:u w:val="single"/>
           <w:color w:val="000000"/>
+          <w:sz w:val="26"/>
+          <w:szCs w:val="26"/>
         </w:rPr>
         <w:t>{{ zam_dekan_info }}</w:t>
       </w:r>
       <w:r>
         <w:rPr>
           <w:rFonts w:ascii="Times New Roman" w:eastAsia="Times New Roman" w:hAnsi="Times New Roman" w:cs="Times New Roman"/>
+          <w:sz w:val="26"/>
+          <w:szCs w:val="26"/>
         </w:rPr>
         <w:t xml:space="preserve"> ва декани факултет </w:t>
       </w:r>
@@ -350,19 +392,23 @@
           <w:iCs w:val="1"/>
           <w:u w:val="single"/>
           <w:color w:val="000000"/>
+          <w:sz w:val="26"/>
+          <w:szCs w:val="26"/>
         </w:rPr>
         <w:t>{{ dekan_info }}</w:t>
       </w:r>
       <w:r>
         <w:rPr>
           <w:rFonts w:ascii="Times New Roman" w:eastAsia="Times New Roman" w:hAnsi="Times New Roman" w:cs="Times New Roman"/>
+          <w:sz w:val="26"/>
+          <w:szCs w:val="26"/>
         </w:rPr>
         <w:t xml:space="preserve"> мунтазам дар тамос шуда, маълумоти лозимаро пурсон шавед.</w:t>
       </w:r>
     </w:p>
     <w:p>
       <w:pPr>
-        <w:spacing w:before="0" w:after="0" w:line="40" w:lineRule="exact" w:beforeAutospacing="0" w:afterAutospacing="0"/>
+        <w:spacing w:before="0" w:after="0" w:line="100" w:lineRule="exact" w:beforeAutospacing="0" w:afterAutospacing="0"/>
       </w:pPr>
     </w:p>
     <w:p>
@@ -378,11 +424,14 @@
         <w:rPr>
           <w:rFonts w:ascii="Times New Roman" w:eastAsia="Times New Roman" w:hAnsi="Times New Roman" w:cs="Times New Roman"/>
         </w:rPr>
-        <w:spacing w:before="0" w:after="0" w:line="240" w:lineRule="auto" w:beforeAutospacing="0" w:afterAutospacing="0"/>
-      </w:pPr>
-      <w:r>
-        <w:rPr>
-          <w:rFonts w:ascii="Times New Roman" w:eastAsia="Times New Roman" w:hAnsi="Times New Roman" w:cs="Times New Roman"/>
+        <w:spacing w:before="0" w:after="40" w:line="260" w:lineRule="auto" w:beforeAutospacing="0" w:afterAutospacing="0"/>
+        <w:jc w:val="both"/>
+      </w:pPr>
+      <w:r>
+        <w:rPr>
+          <w:rFonts w:ascii="Times New Roman" w:eastAsia="Times New Roman" w:hAnsi="Times New Roman" w:cs="Times New Roman"/>
+          <w:sz w:val="26"/>
+          <w:szCs w:val="26"/>
         </w:rPr>
         <w:t>Ҳамзамон хотиррасон менамоем, ки мувофиқи талаботи зербанди 1 моддаи 21 Қонуни Ҷумҳурии Тоҷикистон дар бораи таҳсилоти олии касбӣ ва таҳсилоти касбии баъд аз муассисаи олии таълимӣ донишҷӯ аз муассисаи таҳсилоти олии касбӣ дар мавридҳои зерин хориҷ карда мешавад:</w:t>
       </w:r>
@@ -402,7 +451,8 @@
           <w:i/>
           <w:iCs/>
         </w:rPr>
-        <w:spacing w:before="0" w:after="0" w:line="240" w:lineRule="auto" w:beforeAutospacing="0" w:afterAutospacing="0"/>
+        <w:spacing w:before="0" w:after="0" w:line="260" w:lineRule="auto" w:beforeAutospacing="0" w:afterAutospacing="0"/>
+        <w:jc w:val="both"/>
       </w:pPr>
       <w:r>
         <w:rPr>
@@ -410,6 +460,8 @@
           <w:i/>
           <w:iCs/>
           <w:lang w:val="ru-RU"/>
+          <w:sz w:val="26"/>
+          <w:szCs w:val="26"/>
         </w:rPr>
         <w:t xml:space="preserve">- </w:t>
       </w:r>
@@ -418,6 +470,8 @@
           <w:rFonts w:ascii="Times New Roman" w:eastAsia="Times New Roman" w:hAnsi="Times New Roman" w:cs="Times New Roman"/>
           <w:i/>
           <w:iCs/>
+          <w:sz w:val="26"/>
+          <w:szCs w:val="26"/>
         </w:rPr>
         <w:t>бинобар вазъи саломатӣ дар асоси ҳуҷҷати комиссияи тиббию машваратӣ;</w:t>
       </w:r>
@@ -437,7 +491,8 @@
           <w:i/>
           <w:iCs/>
         </w:rPr>
-        <w:spacing w:before="0" w:after="0" w:line="240" w:lineRule="auto" w:beforeAutospacing="0" w:afterAutospacing="0"/>
+        <w:spacing w:before="0" w:after="0" w:line="260" w:lineRule="auto" w:beforeAutospacing="0" w:afterAutospacing="0"/>
+        <w:jc w:val="both"/>
       </w:pPr>
       <w:r>
         <w:rPr>
@@ -445,6 +500,8 @@
           <w:i/>
           <w:iCs/>
           <w:lang w:val="ru-RU"/>
+          <w:sz w:val="26"/>
+          <w:szCs w:val="26"/>
         </w:rPr>
         <w:t xml:space="preserve">- </w:t>
       </w:r>
@@ -453,6 +510,8 @@
           <w:rFonts w:ascii="Times New Roman" w:eastAsia="Times New Roman" w:hAnsi="Times New Roman" w:cs="Times New Roman"/>
           <w:i/>
           <w:iCs/>
+          <w:sz w:val="26"/>
+          <w:szCs w:val="26"/>
         </w:rPr>
         <w:t>бо сабаби гузаштан ба муассисаи таҳсилоти олии касбии дигар;</w:t>
       </w:r>
@@ -472,13 +531,16 @@
           <w:i/>
           <w:iCs/>
         </w:rPr>
-        <w:spacing w:before="0" w:after="0" w:line="240" w:lineRule="auto" w:beforeAutospacing="0" w:afterAutospacing="0"/>
+        <w:spacing w:before="0" w:after="0" w:line="260" w:lineRule="auto" w:beforeAutospacing="0" w:afterAutospacing="0"/>
+        <w:jc w:val="both"/>
       </w:pPr>
       <w:r>
         <w:rPr>
           <w:rFonts w:ascii="Times New Roman" w:eastAsia="Times New Roman" w:hAnsi="Times New Roman" w:cs="Times New Roman"/>
           <w:i/>
           <w:iCs/>
+          <w:sz w:val="26"/>
+          <w:szCs w:val="26"/>
         </w:rPr>
         <w:t xml:space="preserve">- </w:t>
       </w:r>
@@ -487,6 +549,8 @@
           <w:rFonts w:ascii="Times New Roman" w:eastAsia="Times New Roman" w:hAnsi="Times New Roman" w:cs="Times New Roman"/>
           <w:i/>
           <w:iCs/>
+          <w:sz w:val="26"/>
+          <w:szCs w:val="26"/>
         </w:rPr>
         <w:t>барои давомоти нокифоя (дар як даври академӣ, яъне бесабаб дар ҳаҷми зиёда аз 48 соат ба дарсшиканӣ роҳ додан);</w:t>
       </w:r>
@@ -506,7 +570,8 @@
           <w:i/>
           <w:iCs/>
         </w:rPr>
-        <w:spacing w:before="0" w:after="0" w:line="240" w:lineRule="auto" w:beforeAutospacing="0" w:afterAutospacing="0"/>
+        <w:spacing w:before="0" w:after="0" w:line="260" w:lineRule="auto" w:beforeAutospacing="0" w:afterAutospacing="0"/>
+        <w:jc w:val="both"/>
       </w:pPr>
       <w:r>
         <w:rPr>
@@ -514,6 +579,8 @@
           <w:i/>
           <w:iCs/>
           <w:lang w:val="ru-RU"/>
+          <w:sz w:val="26"/>
+          <w:szCs w:val="26"/>
         </w:rPr>
         <w:t xml:space="preserve">- </w:t>
       </w:r>
@@ -522,6 +589,8 @@
           <w:rFonts w:ascii="Times New Roman" w:eastAsia="Times New Roman" w:hAnsi="Times New Roman" w:cs="Times New Roman"/>
           <w:i/>
           <w:iCs/>
+          <w:sz w:val="26"/>
+          <w:szCs w:val="26"/>
         </w:rPr>
         <w:t>барои қарздории академӣ;</w:t>
       </w:r>
@@ -541,7 +610,8 @@
           <w:i/>
           <w:iCs/>
         </w:rPr>
-        <w:spacing w:before="0" w:after="0" w:line="240" w:lineRule="auto" w:beforeAutospacing="0" w:afterAutospacing="0"/>
+        <w:spacing w:before="0" w:after="0" w:line="260" w:lineRule="auto" w:beforeAutospacing="0" w:afterAutospacing="0"/>
+        <w:jc w:val="both"/>
       </w:pPr>
       <w:r>
         <w:rPr>
@@ -549,6 +619,8 @@
           <w:i/>
           <w:iCs/>
           <w:lang w:val="ru-RU"/>
+          <w:sz w:val="26"/>
+          <w:szCs w:val="26"/>
         </w:rPr>
         <w:t xml:space="preserve">- </w:t>
       </w:r>
@@ -557,6 +629,8 @@
           <w:rFonts w:ascii="Times New Roman" w:eastAsia="Times New Roman" w:hAnsi="Times New Roman" w:cs="Times New Roman"/>
           <w:i/>
           <w:iCs/>
+          <w:sz w:val="26"/>
+          <w:szCs w:val="26"/>
         </w:rPr>
         <w:t>пас аз рухсатии академӣ ба таълим шурӯъ накардан;</w:t>
       </w:r>
@@ -576,7 +650,8 @@
           <w:i/>
           <w:iCs/>
         </w:rPr>
-        <w:spacing w:before="0" w:after="0" w:line="240" w:lineRule="auto" w:beforeAutospacing="0" w:afterAutospacing="0"/>
+        <w:spacing w:before="0" w:after="0" w:line="260" w:lineRule="auto" w:beforeAutospacing="0" w:afterAutospacing="0"/>
+        <w:jc w:val="both"/>
       </w:pPr>
       <w:r>
         <w:rPr>
@@ -584,6 +659,8 @@
           <w:i/>
           <w:iCs/>
           <w:lang w:val="ru-RU"/>
+          <w:sz w:val="26"/>
+          <w:szCs w:val="26"/>
         </w:rPr>
         <w:t xml:space="preserve">- </w:t>
       </w:r>
@@ -592,6 +669,8 @@
           <w:rFonts w:ascii="Times New Roman" w:eastAsia="Times New Roman" w:hAnsi="Times New Roman" w:cs="Times New Roman"/>
           <w:i/>
           <w:iCs/>
+          <w:sz w:val="26"/>
+          <w:szCs w:val="26"/>
         </w:rPr>
         <w:t>саривақт напардохтани маблағи таҳсил мувофиқи шартнома;</w:t>
       </w:r>
@@ -611,7 +690,8 @@
           <w:i/>
           <w:iCs/>
         </w:rPr>
-        <w:spacing w:before="0" w:after="0" w:line="240" w:lineRule="auto" w:beforeAutospacing="0" w:afterAutospacing="0"/>
+        <w:spacing w:before="0" w:after="0" w:line="260" w:lineRule="auto" w:beforeAutospacing="0" w:afterAutospacing="0"/>
+        <w:jc w:val="both"/>
       </w:pPr>
       <w:r>
         <w:rPr>
@@ -619,6 +699,8 @@
           <w:i/>
           <w:iCs/>
           <w:lang w:val="ru-RU"/>
+          <w:sz w:val="26"/>
+          <w:szCs w:val="26"/>
         </w:rPr>
         <w:t xml:space="preserve">- </w:t>
       </w:r>
@@ -627,6 +709,8 @@
           <w:rFonts w:ascii="Times New Roman" w:eastAsia="Times New Roman" w:hAnsi="Times New Roman" w:cs="Times New Roman"/>
           <w:i/>
           <w:iCs/>
+          <w:sz w:val="26"/>
+          <w:szCs w:val="26"/>
         </w:rPr>
         <w:t>дар мӯҳлати муқарраргардида насупоридани се ва зиёда аз он санҷишу имтиҳон;</w:t>
       </w:r>
@@ -646,13 +730,16 @@
           <w:i/>
           <w:iCs/>
         </w:rPr>
-        <w:spacing w:before="0" w:after="0" w:line="240" w:lineRule="auto" w:beforeAutospacing="0" w:afterAutospacing="0"/>
+        <w:spacing w:before="0" w:after="0" w:line="260" w:lineRule="auto" w:beforeAutospacing="0" w:afterAutospacing="0"/>
+        <w:jc w:val="both"/>
       </w:pPr>
       <w:r>
         <w:rPr>
           <w:rFonts w:ascii="Times New Roman" w:eastAsia="Times New Roman" w:hAnsi="Times New Roman" w:cs="Times New Roman"/>
           <w:i/>
           <w:iCs/>
+          <w:sz w:val="26"/>
+          <w:szCs w:val="26"/>
         </w:rPr>
         <w:t xml:space="preserve">- </w:t>
       </w:r>
@@ -661,6 +748,8 @@
           <w:rFonts w:ascii="Times New Roman" w:eastAsia="Times New Roman" w:hAnsi="Times New Roman" w:cs="Times New Roman"/>
           <w:i/>
           <w:iCs/>
+          <w:sz w:val="26"/>
+          <w:szCs w:val="26"/>
         </w:rPr>
         <w:t>барои содир кардани ҷиноят;</w:t>
       </w:r>
@@ -680,13 +769,16 @@
           <w:i/>
           <w:iCs/>
         </w:rPr>
-        <w:spacing w:before="0" w:after="0" w:line="240" w:lineRule="auto" w:beforeAutospacing="0" w:afterAutospacing="0"/>
+        <w:spacing w:before="0" w:after="0" w:line="260" w:lineRule="auto" w:beforeAutospacing="0" w:afterAutospacing="0"/>
+        <w:jc w:val="both"/>
       </w:pPr>
       <w:r>
         <w:rPr>
           <w:rFonts w:ascii="Times New Roman" w:eastAsia="Times New Roman" w:hAnsi="Times New Roman" w:cs="Times New Roman"/>
           <w:i/>
           <w:iCs/>
+          <w:sz w:val="26"/>
+          <w:szCs w:val="26"/>
         </w:rPr>
         <w:t xml:space="preserve">- </w:t>
       </w:r>
@@ -695,6 +787,8 @@
           <w:rFonts w:ascii="Times New Roman" w:eastAsia="Times New Roman" w:hAnsi="Times New Roman" w:cs="Times New Roman"/>
           <w:i/>
           <w:iCs/>
+          <w:sz w:val="26"/>
+          <w:szCs w:val="26"/>
         </w:rPr>
         <w:t>ба муассисаи таълимӣ омадан бо идора намудани воситаҳои нақлиёти механикӣ, (бе ҳуқуқи барқароршавӣ ба муддати се сол);</w:t>
       </w:r>
@@ -702,7 +796,7 @@
     <w:tbl>
       <w:tblPr>
         <w:tblStyle w:val="a"/>
-        <w:tblW w:w="9360" w:type="dxa"/>
+        <w:tblW w:w="10546" w:type="dxa"/>
         <w:tblInd w:w="0" w:type="dxa"/>
         <w:tblBorders>
           <w:top w:val="single" w:sz="8" w:space="0" w:color="000000"/>
@@ -716,10 +810,10 @@
         <w:tblLook w:val="0600" w:firstRow="0" w:lastRow="0" w:firstColumn="0" w:lastColumn="0" w:noHBand="1" w:noVBand="1"/>
       </w:tblPr>
       <w:tblGrid>
-        <w:gridCol w:w="2070"/>
-        <w:gridCol w:w="2610"/>
-        <w:gridCol w:w="2340"/>
-        <w:gridCol w:w="2340"/>
+        <w:gridCol w:w="2332"/>
+        <w:gridCol w:w="2941"/>
+        <w:gridCol w:w="2636"/>
+        <w:gridCol w:w="2636"/>
       </w:tblGrid>
       <w:tr>
         <w:trPr>
@@ -727,7 +821,7 @@
         </w:trPr>
         <w:tc>
           <w:tcPr>
-            <w:tcW w:w="2070" w:type="dxa"/>
+            <w:tcW w:w="2332" w:type="dxa"/>
             <w:tcBorders>
               <w:top w:val="nil"/>
               <w:left w:val="nil"/>
@@ -751,6 +845,8 @@
                 <w:rFonts w:ascii="Times New Roman" w:eastAsia="Times New Roman" w:hAnsi="Times New Roman" w:cs="Times New Roman"/>
                 <w:b/>
                 <w:bCs/>
+                <w:sz w:val="26"/>
+                <w:szCs w:val="26"/>
               </w:rPr>
               <w:t>Бо эҳтиром, декани факултет</w:t>
             </w:r>
@@ -758,7 +854,7 @@
         </w:tc>
         <w:tc>
           <w:tcPr>
-            <w:tcW w:w="2610" w:type="dxa"/>
+            <w:tcW w:w="2941" w:type="dxa"/>
             <w:tcBorders>
               <w:top w:val="nil"/>
               <w:left w:val="nil"/>
@@ -778,6 +874,8 @@
             <w:r>
               <w:rPr>
                 <w:rFonts w:ascii="Times New Roman" w:eastAsia="Times New Roman" w:hAnsi="Times New Roman" w:cs="Times New Roman"/>
+                <w:sz w:val="26"/>
+                <w:szCs w:val="26"/>
               </w:rPr>
               <w:t>____________</w:t>
             </w:r>
@@ -795,8 +893,8 @@
             <w:r>
               <w:rPr>
                 <w:rFonts w:ascii="Times New Roman" w:eastAsia="Times New Roman" w:hAnsi="Times New Roman" w:cs="Times New Roman"/>
-                <w:sz w:val="16"/>
-                <w:szCs w:val="16"/>
+                <w:sz w:val="20"/>
+                <w:szCs w:val="20"/>
               </w:rPr>
               <w:t>имзо ва муҳр</w:t>
             </w:r>
@@ -804,7 +902,7 @@
         </w:tc>
         <w:tc>
           <w:tcPr>
-            <w:tcW w:w="2340" w:type="dxa"/>
+            <w:tcW w:w="2636" w:type="dxa"/>
             <w:tcBorders>
               <w:top w:val="nil"/>
               <w:left w:val="nil"/>
@@ -824,6 +922,8 @@
             <w:r>
               <w:rPr>
                 <w:rFonts w:ascii="Times New Roman" w:eastAsia="Times New Roman" w:hAnsi="Times New Roman" w:cs="Times New Roman"/>
+                <w:sz w:val="26"/>
+                <w:szCs w:val="26"/>
               </w:rPr>
               <w:t>____________</w:t>
             </w:r>
@@ -841,8 +941,8 @@
             <w:r>
               <w:rPr>
                 <w:rFonts w:ascii="Times New Roman" w:eastAsia="Times New Roman" w:hAnsi="Times New Roman" w:cs="Times New Roman"/>
-                <w:sz w:val="16"/>
-                <w:szCs w:val="16"/>
+                <w:sz w:val="20"/>
+                <w:szCs w:val="20"/>
               </w:rPr>
               <w:t>сана</w:t>
             </w:r>
@@ -850,7 +950,7 @@
         </w:tc>
         <w:tc>
           <w:tcPr>
-            <w:tcW w:w="2340" w:type="dxa"/>
+            <w:tcW w:w="2636" w:type="dxa"/>
             <w:tcBorders>
               <w:top w:val="nil"/>
               <w:left w:val="nil"/>
@@ -881,6 +981,8 @@
                 <w:iCs w:val="0"/>
                 <w:u w:val="none"/>
                 <w:color w:val="000000"/>
+                <w:sz w:val="26"/>
+                <w:szCs w:val="26"/>
               </w:rPr>
               <w:t xml:space="preserve">{{ </w:t>
             </w:r>
@@ -895,6 +997,8 @@
                 <w:iCs w:val="0"/>
                 <w:u w:val="none"/>
                 <w:color w:val="000000"/>
+                <w:sz w:val="26"/>
+                <w:szCs w:val="26"/>
               </w:rPr>
               <w:t>dekan</w:t>
             </w:r>
@@ -909,6 +1013,8 @@
                 <w:iCs w:val="0"/>
                 <w:u w:val="none"/>
                 <w:color w:val="000000"/>
+                <w:sz w:val="26"/>
+                <w:szCs w:val="26"/>
               </w:rPr>
               <w:t>_short</w:t>
             </w:r>
@@ -923,6 +1029,8 @@
                 <w:iCs w:val="0"/>
                 <w:u w:val="none"/>
                 <w:color w:val="000000"/>
+                <w:sz w:val="26"/>
+                <w:szCs w:val="26"/>
               </w:rPr>
               <w:t xml:space="preserve"> }}</w:t>
             </w:r>
@@ -937,13 +1045,16 @@
           <w:b/>
           <w:bCs/>
         </w:rPr>
-        <w:spacing w:before="0" w:after="0" w:line="240" w:lineRule="auto" w:beforeAutospacing="0" w:afterAutospacing="0"/>
+        <w:spacing w:before="100" w:after="100" w:line="260" w:lineRule="auto" w:beforeAutospacing="0" w:afterAutospacing="0"/>
+        <w:jc w:val="left"/>
       </w:pPr>
       <w:r>
         <w:rPr>
           <w:rFonts w:ascii="Times New Roman" w:eastAsia="Times New Roman" w:hAnsi="Times New Roman" w:cs="Times New Roman"/>
           <w:b/>
           <w:bCs/>
+          <w:sz w:val="26"/>
+          <w:szCs w:val="26"/>
         </w:rPr>
         <w:t>Огоҳномаро гирифтам ва уҳдадор мешавам, ки ба волидайнам расонам:</w:t>
       </w:r>
@@ -951,7 +1062,7 @@
     <w:tbl>
       <w:tblPr>
         <w:tblStyle w:val="a0"/>
-        <w:tblW w:w="9360" w:type="dxa"/>
+        <w:tblW w:w="10546" w:type="dxa"/>
         <w:tblInd w:w="0" w:type="dxa"/>
         <w:tblBorders>
           <w:top w:val="single" w:sz="8" w:space="0" w:color="000000"/>
@@ -965,9 +1076,9 @@
         <w:tblLook w:val="0600" w:firstRow="0" w:lastRow="0" w:firstColumn="0" w:lastColumn="0" w:noHBand="1" w:noVBand="1"/>
       </w:tblPr>
       <w:tblGrid>
-        <w:gridCol w:w="3900"/>
-        <w:gridCol w:w="3420"/>
-        <w:gridCol w:w="2040"/>
+        <w:gridCol w:w="4394"/>
+        <w:gridCol w:w="3853"/>
+        <w:gridCol w:w="2298"/>
       </w:tblGrid>
       <w:tr>
         <w:trPr>
@@ -975,7 +1086,7 @@
         </w:trPr>
         <w:tc>
           <w:tcPr>
-            <w:tcW w:w="3900" w:type="dxa"/>
+            <w:tcW w:w="4394" w:type="dxa"/>
             <w:tcBorders>
               <w:top w:val="nil"/>
               <w:left w:val="nil"/>
@@ -1006,6 +1117,8 @@
                 <w:iCs w:val="0"/>
                 <w:u w:val="none"/>
                 <w:color w:val="000000"/>
+                <w:sz w:val="26"/>
+                <w:szCs w:val="26"/>
               </w:rPr>
               <w:t xml:space="preserve">{{ </w:t>
             </w:r>
@@ -1020,6 +1133,8 @@
                 <w:iCs w:val="0"/>
                 <w:u w:val="none"/>
                 <w:color w:val="000000"/>
+                <w:sz w:val="26"/>
+                <w:szCs w:val="26"/>
               </w:rPr>
               <w:t>student</w:t>
             </w:r>
@@ -1034,6 +1149,8 @@
                 <w:iCs w:val="0"/>
                 <w:u w:val="none"/>
                 <w:color w:val="000000"/>
+                <w:sz w:val="26"/>
+                <w:szCs w:val="26"/>
               </w:rPr>
               <w:t>_short</w:t>
             </w:r>
@@ -1048,6 +1165,8 @@
                 <w:iCs w:val="0"/>
                 <w:u w:val="none"/>
                 <w:color w:val="000000"/>
+                <w:sz w:val="26"/>
+                <w:szCs w:val="26"/>
               </w:rPr>
               <w:t xml:space="preserve"> }}</w:t>
             </w:r>
@@ -1055,7 +1174,7 @@
         </w:tc>
         <w:tc>
           <w:tcPr>
-            <w:tcW w:w="3420" w:type="dxa"/>
+            <w:tcW w:w="3853" w:type="dxa"/>
             <w:tcBorders>
               <w:top w:val="nil"/>
               <w:left w:val="nil"/>
@@ -1075,6 +1194,8 @@
             <w:r>
               <w:rPr>
                 <w:rFonts w:ascii="Times New Roman" w:eastAsia="Times New Roman" w:hAnsi="Times New Roman" w:cs="Times New Roman"/>
+                <w:sz w:val="26"/>
+                <w:szCs w:val="26"/>
               </w:rPr>
               <w:t>__________________</w:t>
             </w:r>
@@ -1092,8 +1213,8 @@
             <w:r>
               <w:rPr>
                 <w:rFonts w:ascii="Times New Roman" w:eastAsia="Times New Roman" w:hAnsi="Times New Roman" w:cs="Times New Roman"/>
-                <w:sz w:val="16"/>
-                <w:szCs w:val="16"/>
+                <w:sz w:val="20"/>
+                <w:szCs w:val="20"/>
               </w:rPr>
               <w:t>рақами телефони волидайн</w:t>
             </w:r>
@@ -1101,7 +1222,7 @@
         </w:tc>
         <w:tc>
           <w:tcPr>
-            <w:tcW w:w="2040" w:type="dxa"/>
+            <w:tcW w:w="2298" w:type="dxa"/>
             <w:tcBorders>
               <w:top w:val="nil"/>
               <w:left w:val="nil"/>
@@ -1121,6 +1242,8 @@
             <w:r>
               <w:rPr>
                 <w:rFonts w:ascii="Times New Roman" w:eastAsia="Times New Roman" w:hAnsi="Times New Roman" w:cs="Times New Roman"/>
+                <w:sz w:val="26"/>
+                <w:szCs w:val="26"/>
               </w:rPr>
               <w:t>____________</w:t>
             </w:r>
@@ -1138,8 +1261,8 @@
             <w:r>
               <w:rPr>
                 <w:rFonts w:ascii="Times New Roman" w:eastAsia="Times New Roman" w:hAnsi="Times New Roman" w:cs="Times New Roman"/>
-                <w:sz w:val="16"/>
-                <w:szCs w:val="16"/>
+                <w:sz w:val="20"/>
+                <w:szCs w:val="20"/>
               </w:rPr>
               <w:t>имзо</w:t>
             </w:r>
@@ -1163,13 +1286,16 @@
           <w:sz w:val="24"/>
           <w:szCs w:val="24"/>
         </w:rPr>
-        <w:spacing w:before="0" w:after="0" w:line="240" w:lineRule="auto" w:beforeAutospacing="0" w:afterAutospacing="0"/>
+        <w:spacing w:before="100" w:after="100" w:line="260" w:lineRule="auto" w:beforeAutospacing="0" w:afterAutospacing="0"/>
+        <w:jc w:val="left"/>
       </w:pPr>
       <w:r>
         <w:rPr>
           <w:rFonts w:ascii="Times New Roman" w:eastAsia="Times New Roman" w:hAnsi="Times New Roman" w:cs="Times New Roman"/>
           <w:b/>
           <w:bCs/>
+          <w:sz w:val="26"/>
+          <w:szCs w:val="26"/>
         </w:rPr>
         <w:t>Бо мазмуни огоҳинома шинос гардидам:</w:t>
       </w:r>
@@ -1188,13 +1314,13 @@
           <w:b/>
           <w:bCs/>
         </w:rPr>
-        <w:spacing w:before="0" w:after="0" w:line="40" w:lineRule="exact" w:beforeAutospacing="0" w:afterAutospacing="0"/>
+        <w:spacing w:before="0" w:after="0" w:line="100" w:lineRule="exact" w:beforeAutospacing="0" w:afterAutospacing="0"/>
       </w:pPr>
     </w:p>
     <w:tbl>
       <w:tblPr>
         <w:tblStyle w:val="a1"/>
-        <w:tblW w:w="9360" w:type="dxa"/>
+        <w:tblW w:w="10546" w:type="dxa"/>
         <w:tblInd w:w="0" w:type="dxa"/>
         <w:tblBorders>
           <w:top w:val="single" w:sz="8" w:space="0" w:color="000000"/>
@@ -1208,9 +1334,9 @@
         <w:tblLook w:val="0600" w:firstRow="0" w:lastRow="0" w:firstColumn="0" w:lastColumn="0" w:noHBand="1" w:noVBand="1"/>
       </w:tblPr>
       <w:tblGrid>
-        <w:gridCol w:w="3930"/>
-        <w:gridCol w:w="3510"/>
-        <w:gridCol w:w="1920"/>
+        <w:gridCol w:w="4428"/>
+        <w:gridCol w:w="3955"/>
+        <w:gridCol w:w="2163"/>
       </w:tblGrid>
       <w:tr>
         <w:trPr>
@@ -1218,7 +1344,7 @@
         </w:trPr>
         <w:tc>
           <w:tcPr>
-            <w:tcW w:w="3930" w:type="dxa"/>
+            <w:tcW w:w="4428" w:type="dxa"/>
             <w:tcBorders>
               <w:top w:val="nil"/>
               <w:left w:val="nil"/>
@@ -1236,6 +1362,8 @@
             <w:r>
               <w:rPr>
                 <w:rFonts w:ascii="Times New Roman" w:eastAsia="Times New Roman" w:hAnsi="Times New Roman" w:cs="Times New Roman"/>
+                <w:sz w:val="26"/>
+                <w:szCs w:val="26"/>
               </w:rPr>
               <w:t xml:space="preserve">__________________ </w:t>
             </w:r>
@@ -1252,8 +1380,8 @@
             <w:r>
               <w:rPr>
                 <w:rFonts w:ascii="Times New Roman" w:eastAsia="Times New Roman" w:hAnsi="Times New Roman" w:cs="Times New Roman"/>
-                <w:sz w:val="16"/>
-                <w:szCs w:val="16"/>
+                <w:sz w:val="20"/>
+                <w:szCs w:val="20"/>
               </w:rPr>
               <w:t xml:space="preserve">      ному насаби волидайн</w:t>
             </w:r>
@@ -1262,6 +1390,8 @@
                 <w:rFonts w:ascii="Times New Roman" w:eastAsia="Times New Roman" w:hAnsi="Times New Roman" w:cs="Times New Roman"/>
                 <w:b/>
                 <w:bCs/>
+                <w:sz w:val="20"/>
+                <w:szCs w:val="20"/>
               </w:rPr>
               <w:t xml:space="preserve"> </w:t>
             </w:r>
@@ -1269,7 +1399,7 @@
         </w:tc>
         <w:tc>
           <w:tcPr>
-            <w:tcW w:w="3510" w:type="dxa"/>
+            <w:tcW w:w="3955" w:type="dxa"/>
             <w:tcBorders>
               <w:top w:val="nil"/>
               <w:left w:val="nil"/>
@@ -1288,6 +1418,8 @@
             <w:r>
               <w:rPr>
                 <w:rFonts w:ascii="Times New Roman" w:eastAsia="Times New Roman" w:hAnsi="Times New Roman" w:cs="Times New Roman"/>
+                <w:sz w:val="26"/>
+                <w:szCs w:val="26"/>
               </w:rPr>
               <w:t xml:space="preserve">__________________ </w:t>
             </w:r>
@@ -1305,8 +1437,8 @@
             <w:r>
               <w:rPr>
                 <w:rFonts w:ascii="Times New Roman" w:eastAsia="Times New Roman" w:hAnsi="Times New Roman" w:cs="Times New Roman"/>
-                <w:sz w:val="16"/>
-                <w:szCs w:val="16"/>
+                <w:sz w:val="20"/>
+                <w:szCs w:val="20"/>
               </w:rPr>
               <w:t>рақами телефони волидайн</w:t>
             </w:r>
@@ -1314,7 +1446,7 @@
         </w:tc>
         <w:tc>
           <w:tcPr>
-            <w:tcW w:w="1920" w:type="dxa"/>
+            <w:tcW w:w="2163" w:type="dxa"/>
             <w:tcBorders>
               <w:top w:val="nil"/>
               <w:left w:val="nil"/>
@@ -1333,6 +1465,8 @@
             <w:r>
               <w:rPr>
                 <w:rFonts w:ascii="Times New Roman" w:eastAsia="Times New Roman" w:hAnsi="Times New Roman" w:cs="Times New Roman"/>
+                <w:sz w:val="26"/>
+                <w:szCs w:val="26"/>
               </w:rPr>
               <w:t>____________</w:t>
             </w:r>
@@ -1350,14 +1484,16 @@
             <w:r>
               <w:rPr>
                 <w:rFonts w:ascii="Times New Roman" w:eastAsia="Times New Roman" w:hAnsi="Times New Roman" w:cs="Times New Roman"/>
-                <w:sz w:val="16"/>
-                <w:szCs w:val="16"/>
+                <w:sz w:val="20"/>
+                <w:szCs w:val="20"/>
               </w:rPr>
               <w:t>имзо</w:t>
             </w:r>
             <w:r>
               <w:rPr>
                 <w:rFonts w:ascii="Times New Roman" w:eastAsia="Times New Roman" w:hAnsi="Times New Roman" w:cs="Times New Roman"/>
+                <w:sz w:val="20"/>
+                <w:szCs w:val="20"/>
               </w:rPr>
               <w:t xml:space="preserve"> </w:t>
             </w:r>
@@ -1368,7 +1504,7 @@
     <w:p>
       <w:pPr>
         <w:pStyle w:val="Heading3"/>
-        <w:spacing w:before="0" w:after="0" w:line="40" w:lineRule="exact" w:beforeAutospacing="0" w:afterAutospacing="0"/>
+        <w:spacing w:before="0" w:after="0" w:line="100" w:lineRule="exact" w:beforeAutospacing="0" w:afterAutospacing="0"/>
         <w:ind w:right="-900"/>
         <w:rPr>
           <w:rFonts w:ascii="Times New Roman" w:eastAsia="Times New Roman" w:hAnsi="Times New Roman" w:cs="Times New Roman"/>
@@ -1377,7 +1513,7 @@
     </w:p>
     <w:sectPr>
       <w:pgSz w:w="11906" w:h="16838"/>
-      <w:pgMar w:top="850" w:right="1021" w:bottom="850" w:left="1021" w:header="0" w:footer="0" w:gutter="0"/>
+      <w:pgMar w:top="567" w:right="680" w:bottom="680" w:left="680" w:header="0" w:footer="0" w:gutter="0"/>
       <w:pgNumType w:start="1"/>
       <w:cols w:space="720"/>
     </w:sectPr>

</xml_diff>